<commit_message>
Docs : mise à jour README et Nexus_Presentation selon les nouvelles fonctionnalités
README :
- Bootstrap admin via variables d'env (remplace le script Python manuel)
- Ajout ADMIN_BOOTSTRAP_* dans la table des variables d'environnement
- Descriptions auth.py et email_service mises à jour
- Audit log : ajout des événements password_changed et email_verified
- Section Administration : sous-section bootstrap du premier admin

Nexus_Presentation.docx :
- Section 1.3 : ajout puce profil étendu en self-service
- Section 2.3 (table users) : ajout colonnes full_name, phone, birth_date,
  gender, address, avatar
- Section 5.1 : ajout paragraphe bootstrap admin via variables d'env
- Ajout UC11 (profil étendu), UC12 (identifiants), UC13 (mot de passe)
- Sommaire : 3. Cas d'utilisation (UC1 à UC13)
- Conclusion : mention de la gestion de profil self-service
</commit_message>
<xml_diff>
--- a/Nexus_Presentation.docx
+++ b/Nexus_Presentation.docx
@@ -110,7 +110,163 @@
         <w:pStyle w:val="ListBullet"/>
       </w:pPr>
       <w:r>
-        <w:t>3. Cas d’utilisation</w:t>
+        <w:t>3. Cas d'utilisation (UC1 a UC13)</w:t>
+      </w:r>
+    </w:p>
+    <w:p>
+      <w:r>
+        <w:t xml:space="preserve">Resultat : Le mot de passe est modifie immediatement ; l'evenement est enregistre dans le journal d'audit (password_changed).</w:t>
+      </w:r>
+    </w:p>
+    <w:p>
+      <w:pPr>
+        <w:pStyle w:val="ListNumber"/>
+      </w:pPr>
+      <w:r>
+        <w:t xml:space="preserve">Nexus verifie la correspondance et met a jour le hash bcrypt.</w:t>
+      </w:r>
+    </w:p>
+    <w:p>
+      <w:pPr>
+        <w:pStyle w:val="ListNumber"/>
+      </w:pPr>
+      <w:r>
+        <w:t xml:space="preserve">Il saisit le nouveau mot de passe (min. 8 caracteres) et le confirme.</w:t>
+      </w:r>
+    </w:p>
+    <w:p>
+      <w:pPr>
+        <w:pStyle w:val="ListNumber"/>
+      </w:pPr>
+      <w:r>
+        <w:t xml:space="preserve">Depuis les Parametres, section « Securite », l'utilisateur saisit son mot de passe actuel pour confirmer son identite.</w:t>
+      </w:r>
+    </w:p>
+    <w:p>
+      <w:r>
+        <w:t xml:space="preserve">Deroulement :</w:t>
+      </w:r>
+    </w:p>
+    <w:p>
+      <w:r>
+        <w:t xml:space="preserve">Declencheur : L'utilisateur souhaite changer son mot de passe sans passer par le flux Mot de passe oublie (il connait encore l'actuel).</w:t>
+      </w:r>
+    </w:p>
+    <w:p>
+      <w:r>
+        <w:t xml:space="preserve">Acteur : Utilisateur connecte</w:t>
+      </w:r>
+    </w:p>
+    <w:p>
+      <w:pPr>
+        <w:pStyle w:val="Heading2"/>
+      </w:pPr>
+      <w:r>
+        <w:t xml:space="preserve">UC13 - Changement de mot de passe depuis le profil</w:t>
+      </w:r>
+    </w:p>
+    <w:p>
+      <w:r>
+        <w:t xml:space="preserve">Resultat : Les identifiants sont mis a jour. L'e-mail n'est modifie qu'apres confirmation, garantissant que l'utilisateur controle bien la nouvelle adresse.</w:t>
+      </w:r>
+    </w:p>
+    <w:p>
+      <w:pPr>
+        <w:pStyle w:val="ListNumber"/>
+      </w:pPr>
+      <w:r>
+        <w:t xml:space="preserve">L'utilisateur clique sur le lien dans l'e-mail recu ; la nouvelle adresse est alors appliquee en base.</w:t>
+      </w:r>
+    </w:p>
+    <w:p>
+      <w:pPr>
+        <w:pStyle w:val="ListNumber"/>
+      </w:pPr>
+      <w:r>
+        <w:t xml:space="preserve">Pour changer l'e-mail, il saisit la nouvelle adresse ; Nexus envoie un lien de confirmation a cette adresse (valable 1 heure).</w:t>
+      </w:r>
+    </w:p>
+    <w:p>
+      <w:pPr>
+        <w:pStyle w:val="ListNumber"/>
+      </w:pPr>
+      <w:r>
+        <w:t xml:space="preserve">Depuis les Parametres, section « Identifiants », l'utilisateur saisit un nouveau nom d'utilisateur (min. 3 caracteres, pas d'arobase, unicite verifiee) et valide.</w:t>
+      </w:r>
+    </w:p>
+    <w:p>
+      <w:r>
+        <w:t xml:space="preserve">Deroulement :</w:t>
+      </w:r>
+    </w:p>
+    <w:p>
+      <w:r>
+        <w:t xml:space="preserve">Declencheur : L'utilisateur souhaite changer son nom d'utilisateur ou son adresse e-mail.</w:t>
+      </w:r>
+    </w:p>
+    <w:p>
+      <w:r>
+        <w:t xml:space="preserve">Acteur : Utilisateur connecte</w:t>
+      </w:r>
+    </w:p>
+    <w:p>
+      <w:pPr>
+        <w:pStyle w:val="Heading2"/>
+      </w:pPr>
+      <w:r>
+        <w:t xml:space="preserve">UC12 - Modification des identifiants (nom d'utilisateur et e-mail)</w:t>
+      </w:r>
+    </w:p>
+    <w:p>
+      <w:r>
+        <w:t xml:space="preserve">Resultat : Le profil affiche les nouvelles informations ; l'avatar apparait a la place des initiales.</w:t>
+      </w:r>
+    </w:p>
+    <w:p>
+      <w:pPr>
+        <w:pStyle w:val="ListNumber"/>
+      </w:pPr>
+      <w:r>
+        <w:t xml:space="preserve">Il enregistre ; les modifications sont appliquees immediatement.</w:t>
+      </w:r>
+    </w:p>
+    <w:p>
+      <w:pPr>
+        <w:pStyle w:val="ListNumber"/>
+      </w:pPr>
+      <w:r>
+        <w:t xml:space="preserve">Il peut televerser un avatar (JPEG/PNG/WebP, redimensionne a 160x160 et stocke en base64), renseigner son nom complet, telephone, date de naissance, genre et adresse.</w:t>
+      </w:r>
+    </w:p>
+    <w:p>
+      <w:pPr>
+        <w:pStyle w:val="ListNumber"/>
+      </w:pPr>
+      <w:r>
+        <w:t xml:space="preserve">Depuis son profil, l'utilisateur clique sur « Parametres ».</w:t>
+      </w:r>
+    </w:p>
+    <w:p>
+      <w:r>
+        <w:t xml:space="preserve">Deroulement :</w:t>
+      </w:r>
+    </w:p>
+    <w:p>
+      <w:r>
+        <w:t xml:space="preserve">Declencheur : L'utilisateur souhaite personnaliser ses informations personnelles ou sa photo de profil.</w:t>
+      </w:r>
+    </w:p>
+    <w:p>
+      <w:r>
+        <w:t xml:space="preserve">Acteur : Utilisateur connecte</w:t>
+      </w:r>
+    </w:p>
+    <w:p>
+      <w:pPr>
+        <w:pStyle w:val="Heading2"/>
+      </w:pPr>
+      <w:r>
+        <w:t xml:space="preserve">UC11 - Mise a jour du profil etendu</w:t>
       </w:r>
     </w:p>
     <w:p>
@@ -331,6 +487,14 @@
       </w:pPr>
       <w:r>
         <w:t>Site public avec documentation intégrée (guides développeurs et guides utilisateurs) et un formulaire self-service pour qu’une nouvelle application demande à être connectée à Nexus.</w:t>
+      </w:r>
+    </w:p>
+    <w:p>
+      <w:pPr>
+        <w:pStyle w:val="ListBullet"/>
+      </w:pPr>
+      <w:r>
+        <w:t xml:space="preserve">Gestion du profil en self-service : chaque utilisateur peut personnaliser son avatar, ses informations personnelles (nom complet, telephone, date de naissance, genre, adresse) et mettre a jour ses identifiants (nom d'utilisateur, adresse e-mail avec confirmation par lien, mot de passe) directement depuis son espace personnel.</w:t>
       </w:r>
     </w:p>
     <w:p>
@@ -729,7 +893,7 @@
           <w:b w:val="0"/>
           <w:i w:val="0"/>
         </w:rPr>
-        <w:t>Colonnes clés : id, username, email, password_hash (bcrypt), is_admin, is_active, totp_secret (chiffré AES-256-GCM), totp_enabled, backup_codes (hachés bcrypt), failed_login_count, locked_until.</w:t>
+        <w:t>Colonnes clés : id, username, email, password_hash (bcrypt), is_admin, is_active, totp_secret (chiffré AES-256-GCM), totp_enabled, backup_codes (hachés bcrypt), failed_login_count, locked_until Colonnes profil etendu : full_name, phone, birth_date, gender, address, avatar (JPEG 160x160 encode en base64).</w:t>
       </w:r>
     </w:p>
     <w:p>
@@ -2939,6 +3103,11 @@
           <w:i w:val="0"/>
         </w:rPr>
         <w:t>Seuls les comptes marqués is_admin = Vrai dans la base de données peuvent accéder au panneau d’administration (/admin). Une condition supplémentaire, stricte, s’applique : la double authentification (2FA) doit être activée sur ce compte. Si un administrateur n’a pas encore activé sa 2FA, il est automatiquement redirigé vers l’écran d’activation avant de pouvoir continuer.</w:t>
+      </w:r>
+    </w:p>
+    <w:p>
+      <w:r>
+        <w:t xml:space="preserve">Le premier compte administrateur est cree automatiquement au demarrage si aucun admin n'existe encore, a partir de trois variables d'environnement : ADMIN_BOOTSTRAP_EMAIL, ADMIN_BOOTSTRAP_USERNAME et ADMIN_BOOTSTRAP_PASSWORD. Si un compte portant cet e-mail existe deja sans etre administrateur, il est promu automatiquement. Ces variables doivent etre supprimees apres le premier demarrage reussi.</w:t>
       </w:r>
     </w:p>
     <w:p>
@@ -3795,7 +3964,7 @@
           <w:b w:val="0"/>
           <w:i w:val="0"/>
         </w:rPr>
-        <w:t>Nexus répond à un besoin concret : permettre à plusieurs applications de faire confiance à une seule identité, sans jamais partager de mot de passe, en s’appuyant sur des standards ouverts reconnus (OAuth 2.0, OpenID Connect, PKCE). Le projet couvre l’ensemble du cycle de vie attendu d’un service d’authentification professionnel : inscription et connexion sécurisées, double authentification, consentement explicite et révocable, rotation automatique des clés cryptographiques, traçabilité complète des événements de sécurité, et un parcours self-service permettant à de nouvelles applications de rejoindre la plateforme sous contrôle humain.</w:t>
+        <w:t>Nexus répond à un besoin concret : permettre à plusieurs applications de faire confiance à une seule identité, sans jamais partager de mot de passe, en s’appuyant sur des standards ouverts reconnus (OAuth 2.0, OpenID Connect, PKCE). Le projet couvre l’ensemble du cycle de vie attendu d’un service d’authentification professionnel : inscription et connexion sécurisées, double authentification, consentement explicite et révocable, rotation automatique des clés cryptographiques, traçabilité complète des événements de sécurité, et un parcours self-service permettant à de nouvelles applications de rejoindre la plateforme sous contrôle humain. En complement, la gestion du profil etendu en self-service (avatar, informations personnelles, identifiants et mot de passe depuis l'espace personnel) renforce l'autonomie de l'utilisateur sans intervention d'un administrateur.</w:t>
       </w:r>
     </w:p>
     <w:p>

</xml_diff>